<commit_message>
add docx text hightlight support
</commit_message>
<xml_diff>
--- a/public/lesson-1.docx
+++ b/public/lesson-1.docx
@@ -6,70 +6,725 @@
       <w:pPr>
         <w:pStyle w:val="Heading2"/>
         <w:rPr>
-          <w:b w:val="0"/>
-          <w:i w:val="0"/>
-          <w:lang w:val="ru-RU"/>
-        </w:rPr>
-      </w:pPr>
-      <w:r>
-        <w:rPr>
-          <w:b w:val="0"/>
-          <w:i w:val="0"/>
-          <w:lang w:val="ru-RU"/>
-        </w:rPr>
-        <w:t>Урок 1.</w:t>
+          <w:lang w:val="ru-RU"/>
+        </w:rPr>
+      </w:pPr>
+      <w:r>
+        <w:rPr>
+          <w:lang w:val="ru-RU"/>
+        </w:rPr>
+        <w:t>Что такое философия?</w:t>
       </w:r>
     </w:p>
     <w:p>
-      <w:r>
-        <w:rPr>
-          <w:lang w:val="ru-RU"/>
-        </w:rPr>
-        <w:t xml:space="preserve">Все философские работы написаны на «разных языках» в научном смысле слова и представляют собою </w:t>
-      </w:r>
-      <w:r>
-        <w:rPr>
+      <w:pPr>
+        <w:rPr>
+          <w:rFonts w:ascii="Times New Roman" w:hAnsi="Times New Roman" w:cs="Times New Roman"/>
+          <w:sz w:val="28"/>
+          <w:szCs w:val="28"/>
+          <w:lang w:val="ru-RU"/>
+        </w:rPr>
+      </w:pPr>
+      <w:r>
+        <w:rPr>
+          <w:rFonts w:ascii="Times New Roman" w:hAnsi="Times New Roman" w:cs="Times New Roman"/>
+          <w:sz w:val="28"/>
+          <w:szCs w:val="28"/>
+          <w:lang w:val="ru-RU"/>
+        </w:rPr>
+        <w:t>Все философские работы написаны на</w:t>
+      </w:r>
+      <w:r>
+        <w:rPr>
+          <w:rFonts w:ascii="Times New Roman" w:hAnsi="Times New Roman" w:cs="Times New Roman"/>
+          <w:sz w:val="28"/>
+          <w:szCs w:val="28"/>
+          <w:lang w:val="ru-RU"/>
+        </w:rPr>
+        <w:t xml:space="preserve"> </w:t>
+      </w:r>
+      <w:r>
+        <w:rPr>
+          <w:rFonts w:ascii="Times New Roman" w:hAnsi="Times New Roman" w:cs="Times New Roman"/>
+          <w:sz w:val="28"/>
+          <w:szCs w:val="28"/>
+          <w:lang w:val="ru-RU"/>
+        </w:rPr>
+        <w:t>разных</w:t>
+      </w:r>
+      <w:r>
+        <w:rPr>
+          <w:rFonts w:ascii="Times New Roman" w:hAnsi="Times New Roman" w:cs="Times New Roman"/>
+          <w:sz w:val="28"/>
+          <w:szCs w:val="28"/>
+          <w:lang w:val="ru-RU"/>
+        </w:rPr>
+        <w:t xml:space="preserve">, непривычных </w:t>
+      </w:r>
+      <w:r>
+        <w:rPr>
+          <w:rFonts w:ascii="Times New Roman" w:hAnsi="Times New Roman" w:cs="Times New Roman"/>
+          <w:sz w:val="28"/>
+          <w:szCs w:val="28"/>
+          <w:lang w:val="ru-RU"/>
+        </w:rPr>
+        <w:t>языках</w:t>
+      </w:r>
+      <w:r>
+        <w:rPr>
+          <w:rFonts w:ascii="Times New Roman" w:hAnsi="Times New Roman" w:cs="Times New Roman"/>
+          <w:sz w:val="28"/>
+          <w:szCs w:val="28"/>
+          <w:lang w:val="ru-RU"/>
+        </w:rPr>
+        <w:t xml:space="preserve">; у многих работ есть своя собственная терминология; почти каждая работа содержит </w:t>
+      </w:r>
+      <w:r>
+        <w:rPr>
+          <w:rFonts w:ascii="Times New Roman" w:hAnsi="Times New Roman" w:cs="Times New Roman"/>
+          <w:sz w:val="28"/>
+          <w:szCs w:val="28"/>
+          <w:lang w:val="ru-RU"/>
+        </w:rPr>
+        <w:t>противоречивые</w:t>
+      </w:r>
+      <w:r>
+        <w:rPr>
+          <w:rFonts w:ascii="Times New Roman" w:hAnsi="Times New Roman" w:cs="Times New Roman"/>
+          <w:sz w:val="28"/>
+          <w:szCs w:val="28"/>
+          <w:lang w:val="ru-RU"/>
+        </w:rPr>
+        <w:t xml:space="preserve"> по отношению к другим утверждения. В результате </w:t>
+      </w:r>
+      <w:r>
+        <w:rPr>
+          <w:rFonts w:ascii="Times New Roman" w:hAnsi="Times New Roman" w:cs="Times New Roman"/>
+          <w:sz w:val="28"/>
+          <w:szCs w:val="28"/>
+          <w:lang w:val="ru-RU"/>
+        </w:rPr>
+        <w:t xml:space="preserve">понимание философии </w:t>
+      </w:r>
+      <w:r>
+        <w:rPr>
+          <w:rFonts w:ascii="Times New Roman" w:hAnsi="Times New Roman" w:cs="Times New Roman"/>
+          <w:sz w:val="28"/>
+          <w:szCs w:val="28"/>
+          <w:lang w:val="ru-RU"/>
+        </w:rPr>
+        <w:t xml:space="preserve">складывается </w:t>
+      </w:r>
+      <w:r>
+        <w:rPr>
+          <w:rFonts w:ascii="Times New Roman" w:hAnsi="Times New Roman" w:cs="Times New Roman"/>
+          <w:sz w:val="28"/>
+          <w:szCs w:val="28"/>
+          <w:lang w:val="ru-RU"/>
+        </w:rPr>
+        <w:t>в идею</w:t>
+      </w:r>
+      <w:r>
+        <w:rPr>
+          <w:rFonts w:ascii="Times New Roman" w:hAnsi="Times New Roman" w:cs="Times New Roman"/>
+          <w:sz w:val="28"/>
+          <w:szCs w:val="28"/>
+          <w:lang w:val="ru-RU"/>
+        </w:rPr>
+        <w:t xml:space="preserve"> </w:t>
+      </w:r>
+      <w:r>
+        <w:rPr>
+          <w:rFonts w:ascii="Times New Roman" w:hAnsi="Times New Roman" w:cs="Times New Roman"/>
           <w:i/>
+          <w:sz w:val="28"/>
+          <w:szCs w:val="28"/>
           <w:lang w:val="ru-RU"/>
         </w:rPr>
         <w:t>ассорти</w:t>
       </w:r>
       <w:r>
         <w:rPr>
-          <w:lang w:val="ru-RU"/>
-        </w:rPr>
-        <w:t xml:space="preserve">. </w:t>
-      </w:r>
-      <w:r>
-        <w:t>Скептики не мешают философии — философии мешают адепты. Вся философия это процесс, эволюция одних мыслей в другие. Чтобы понять философию, нужно понять логику развития этого процесса. Философию можно представить в виде графа. Точкой входа можно выбрать любой узел (любого философа), но при этом узнать его источники и эволюцию его мысли.</w:t>
+          <w:rFonts w:ascii="Times New Roman" w:hAnsi="Times New Roman" w:cs="Times New Roman"/>
+          <w:iCs/>
+          <w:sz w:val="28"/>
+          <w:szCs w:val="28"/>
+          <w:lang w:val="ru-RU"/>
+        </w:rPr>
+        <w:t>.</w:t>
       </w:r>
     </w:p>
     <w:p>
-      <w:r>
-        <w:t xml:space="preserve">Предмет философии (что изучает философия?) Это </w:t>
-      </w:r>
-      <w:r>
-        <w:rPr>
-          <w:b/>
-        </w:rPr>
-        <w:t>Картина мира</w:t>
-      </w:r>
-      <w:r>
-        <w:t xml:space="preserve"> или </w:t>
-      </w:r>
-      <w:r>
-        <w:rPr>
-          <w:b/>
-        </w:rPr>
-        <w:t>модель реальности</w:t>
-      </w:r>
-      <w:r>
-        <w:t xml:space="preserve"> Первая модель реальности была получена нами, даже встроена в нас, в процессе социализации.</w:t>
+      <w:pPr>
+        <w:pStyle w:val="NormalWeb"/>
+        <w:spacing w:before="0" w:beforeAutospacing="0" w:after="180" w:afterAutospacing="0"/>
+        <w:ind w:right="315"/>
+        <w:rPr>
+          <w:sz w:val="28"/>
+          <w:szCs w:val="28"/>
+        </w:rPr>
+      </w:pPr>
+      <w:r>
+        <w:rPr>
+          <w:sz w:val="28"/>
+          <w:szCs w:val="28"/>
+          <w:lang w:val="ru-RU"/>
+        </w:rPr>
+        <w:t>П</w:t>
+      </w:r>
+      <w:r>
+        <w:rPr>
+          <w:sz w:val="28"/>
+          <w:szCs w:val="28"/>
+          <w:lang w:val="ru-RU"/>
+        </w:rPr>
+        <w:t xml:space="preserve">редставление о философии как о наборе несвязанных идей </w:t>
+      </w:r>
+      <w:r>
+        <w:rPr>
+          <w:sz w:val="28"/>
+          <w:szCs w:val="28"/>
+        </w:rPr>
+        <w:t>порождает два типа реакций:</w:t>
       </w:r>
     </w:p>
     <w:p>
-      <w:r>
+      <w:pPr>
+        <w:pStyle w:val="ListParagraph"/>
+        <w:numPr>
+          <w:ilvl w:val="0"/>
+          <w:numId w:val="15"/>
+        </w:numPr>
+        <w:spacing w:before="100" w:beforeAutospacing="1" w:after="210"/>
+        <w:ind w:right="315"/>
+        <w:rPr>
+          <w:rFonts w:ascii="Times New Roman" w:eastAsia="Times New Roman" w:hAnsi="Times New Roman" w:cs="Times New Roman"/>
+          <w:sz w:val="28"/>
+          <w:szCs w:val="28"/>
+          <w:lang w:val="en-RU" w:eastAsia="en-GB"/>
+        </w:rPr>
+      </w:pPr>
+      <w:r>
+        <w:rPr>
+          <w:rFonts w:ascii="Times New Roman" w:eastAsia="Times New Roman" w:hAnsi="Times New Roman" w:cs="Times New Roman"/>
+          <w:b/>
+          <w:bCs/>
+          <w:sz w:val="28"/>
+          <w:szCs w:val="28"/>
+          <w:lang w:val="en-RU" w:eastAsia="en-GB"/>
+        </w:rPr>
+        <w:t>Скептики</w:t>
+      </w:r>
+      <w:r>
+        <w:rPr>
+          <w:rFonts w:ascii="Times New Roman" w:eastAsia="Times New Roman" w:hAnsi="Times New Roman" w:cs="Times New Roman"/>
+          <w:sz w:val="28"/>
+          <w:szCs w:val="28"/>
+          <w:lang w:val="en-RU" w:eastAsia="en-GB"/>
+        </w:rPr>
+        <w:t>. Люди, настроенные критически, сомневающиеся в ценности философии. Они не мешают философам</w:t>
+      </w:r>
+      <w:r>
+        <w:rPr>
+          <w:rFonts w:ascii="Times New Roman" w:eastAsia="Times New Roman" w:hAnsi="Times New Roman" w:cs="Times New Roman"/>
+          <w:sz w:val="28"/>
+          <w:szCs w:val="28"/>
+          <w:lang w:val="ru-RU" w:eastAsia="en-GB"/>
+        </w:rPr>
+        <w:t xml:space="preserve"> </w:t>
+      </w:r>
+      <w:r>
+        <w:rPr>
+          <w:rFonts w:ascii="Times New Roman" w:eastAsia="Times New Roman" w:hAnsi="Times New Roman" w:cs="Times New Roman"/>
+          <w:sz w:val="28"/>
+          <w:szCs w:val="28"/>
+          <w:lang w:val="en-RU" w:eastAsia="en-GB"/>
+        </w:rPr>
+        <w:t>и не представляют</w:t>
+      </w:r>
+      <w:r>
+        <w:rPr>
+          <w:rFonts w:ascii="Times New Roman" w:eastAsia="Times New Roman" w:hAnsi="Times New Roman" w:cs="Times New Roman"/>
+          <w:sz w:val="28"/>
+          <w:szCs w:val="28"/>
+          <w:lang w:val="ru-RU" w:eastAsia="en-GB"/>
+        </w:rPr>
+        <w:t xml:space="preserve"> </w:t>
+      </w:r>
+      <w:r>
+        <w:rPr>
+          <w:rFonts w:ascii="Times New Roman" w:eastAsia="Times New Roman" w:hAnsi="Times New Roman" w:cs="Times New Roman"/>
+          <w:sz w:val="28"/>
+          <w:szCs w:val="28"/>
+          <w:lang w:val="en-RU" w:eastAsia="en-GB"/>
+        </w:rPr>
+        <w:t>особого интереса.</w:t>
+      </w:r>
+    </w:p>
+    <w:p>
+      <w:pPr>
+        <w:pStyle w:val="ListParagraph"/>
+        <w:numPr>
+          <w:ilvl w:val="0"/>
+          <w:numId w:val="15"/>
+        </w:numPr>
+        <w:spacing w:before="100" w:beforeAutospacing="1" w:after="210"/>
+        <w:ind w:right="315"/>
+        <w:rPr>
+          <w:rFonts w:ascii="Times New Roman" w:eastAsia="Times New Roman" w:hAnsi="Times New Roman" w:cs="Times New Roman"/>
+          <w:sz w:val="28"/>
+          <w:szCs w:val="28"/>
+          <w:lang w:val="en-RU" w:eastAsia="en-GB"/>
+        </w:rPr>
+      </w:pPr>
+      <w:r>
+        <w:rPr>
+          <w:rFonts w:ascii="Times New Roman" w:eastAsia="Times New Roman" w:hAnsi="Times New Roman" w:cs="Times New Roman"/>
+          <w:b/>
+          <w:bCs/>
+          <w:sz w:val="28"/>
+          <w:szCs w:val="28"/>
+          <w:lang w:val="en-RU" w:eastAsia="en-GB"/>
+        </w:rPr>
+        <w:t>Адепты</w:t>
+      </w:r>
+      <w:r>
+        <w:rPr>
+          <w:rFonts w:ascii="Times New Roman" w:eastAsia="Times New Roman" w:hAnsi="Times New Roman" w:cs="Times New Roman"/>
+          <w:sz w:val="28"/>
+          <w:szCs w:val="28"/>
+          <w:lang w:val="en-RU" w:eastAsia="en-GB"/>
+        </w:rPr>
+        <w:t>. Это последователи какой-то одной конкретной концепции. Они наносят наибольший вред пониманию философии, поскольку зацикливаются на одной идее, отрицая все остальные. Выбрав одну книгу или одного философа</w:t>
+      </w:r>
+      <w:r>
+        <w:rPr>
+          <w:rFonts w:ascii="Times New Roman" w:eastAsia="Times New Roman" w:hAnsi="Times New Roman" w:cs="Times New Roman"/>
+          <w:sz w:val="28"/>
+          <w:szCs w:val="28"/>
+          <w:lang w:val="ru-RU" w:eastAsia="en-GB"/>
+        </w:rPr>
+        <w:t xml:space="preserve">, </w:t>
+      </w:r>
+      <w:r>
+        <w:rPr>
+          <w:rFonts w:ascii="Times New Roman" w:eastAsia="Times New Roman" w:hAnsi="Times New Roman" w:cs="Times New Roman"/>
+          <w:sz w:val="28"/>
+          <w:szCs w:val="28"/>
+          <w:lang w:val="en-RU" w:eastAsia="en-GB"/>
+        </w:rPr>
+        <w:t>адепт начинает измерять все остальные концепции по степени их приближенности к выбранному идеалу, яростно отстаивая свою точку зрения.</w:t>
+      </w:r>
+    </w:p>
+    <w:p>
+      <w:pPr>
+        <w:pStyle w:val="Heading3"/>
+        <w:rPr>
+          <w:lang w:val="ru-RU"/>
+        </w:rPr>
+      </w:pPr>
+      <w:r>
+        <w:rPr>
+          <w:lang w:val="ru-RU"/>
+        </w:rPr>
+        <w:t>Философия как процесс</w:t>
+      </w:r>
+    </w:p>
+    <w:p>
+      <w:pPr>
+        <w:rPr>
+          <w:rFonts w:ascii="Times New Roman" w:hAnsi="Times New Roman" w:cs="Times New Roman"/>
+          <w:sz w:val="28"/>
+          <w:szCs w:val="28"/>
+          <w:lang w:val="ru-RU"/>
+        </w:rPr>
+      </w:pPr>
+      <w:r>
+        <w:rPr>
+          <w:rFonts w:ascii="Times New Roman" w:hAnsi="Times New Roman" w:cs="Times New Roman"/>
+          <w:sz w:val="28"/>
+          <w:szCs w:val="28"/>
+          <w:lang w:val="ru-RU"/>
+        </w:rPr>
+        <w:t xml:space="preserve">Ключ к правильному пониманию философии заключается в том, что это не набор конфликтующих идей, а процесс. Каждая концепция является следствием предыдущей, ответом на её проблемы и недостатки. </w:t>
+      </w:r>
+      <w:r>
+        <w:rPr>
+          <w:rFonts w:ascii="Times New Roman" w:hAnsi="Times New Roman" w:cs="Times New Roman"/>
+          <w:sz w:val="28"/>
+          <w:szCs w:val="28"/>
+          <w:lang w:val="ru-RU"/>
+        </w:rPr>
+        <w:t>Чтобы понять философию, нужно понять логику развития этого процесса.</w:t>
+      </w:r>
+    </w:p>
+    <w:p>
+      <w:pPr>
+        <w:pStyle w:val="Heading3"/>
+        <w:rPr>
+          <w:lang w:val="ru-RU"/>
+        </w:rPr>
+      </w:pPr>
+      <w:r>
+        <w:rPr>
+          <w:lang w:val="ru-RU"/>
+        </w:rPr>
+        <w:t>Философия как граф</w:t>
+      </w:r>
+    </w:p>
+    <w:p>
+      <w:pPr>
+        <w:rPr>
+          <w:rFonts w:ascii="Times New Roman" w:hAnsi="Times New Roman" w:cs="Times New Roman"/>
+          <w:sz w:val="28"/>
+          <w:szCs w:val="28"/>
+          <w:lang w:val="ru-RU"/>
+        </w:rPr>
+      </w:pPr>
+      <w:r>
+        <w:rPr>
+          <w:rFonts w:ascii="Times New Roman" w:hAnsi="Times New Roman" w:cs="Times New Roman"/>
+          <w:sz w:val="28"/>
+          <w:szCs w:val="28"/>
+          <w:lang w:val="ru-RU"/>
+        </w:rPr>
+        <w:t>Если представить связь между концепциями графически, то получится не линия, а сложный, разветвленный граф</w:t>
+      </w:r>
+      <w:r>
+        <w:rPr>
+          <w:rFonts w:ascii="Times New Roman" w:hAnsi="Times New Roman" w:cs="Times New Roman"/>
+          <w:sz w:val="28"/>
+          <w:szCs w:val="28"/>
+          <w:lang w:val="ru-RU"/>
+        </w:rPr>
+        <w:t>.</w:t>
+      </w:r>
+      <w:r>
+        <w:rPr>
+          <w:rFonts w:ascii="Times New Roman" w:hAnsi="Times New Roman" w:cs="Times New Roman"/>
+          <w:sz w:val="28"/>
+          <w:szCs w:val="28"/>
+          <w:lang w:val="ru-RU"/>
+        </w:rPr>
+        <w:t xml:space="preserve"> Точкой входа можно выбрать любой узел</w:t>
+      </w:r>
+      <w:r>
+        <w:rPr>
+          <w:rFonts w:ascii="Times New Roman" w:hAnsi="Times New Roman" w:cs="Times New Roman"/>
+          <w:sz w:val="28"/>
+          <w:szCs w:val="28"/>
+          <w:lang w:val="ru-RU"/>
+        </w:rPr>
+        <w:t xml:space="preserve">, то есть </w:t>
+      </w:r>
+      <w:r>
+        <w:rPr>
+          <w:rFonts w:ascii="Times New Roman" w:hAnsi="Times New Roman" w:cs="Times New Roman"/>
+          <w:sz w:val="28"/>
+          <w:szCs w:val="28"/>
+          <w:lang w:val="ru-RU"/>
+        </w:rPr>
+        <w:t>любого философа, но при этом</w:t>
+      </w:r>
+      <w:r>
+        <w:rPr>
+          <w:rFonts w:ascii="Times New Roman" w:hAnsi="Times New Roman" w:cs="Times New Roman"/>
+          <w:sz w:val="28"/>
+          <w:szCs w:val="28"/>
+          <w:lang w:val="ru-RU"/>
+        </w:rPr>
+        <w:t xml:space="preserve"> важно</w:t>
+      </w:r>
+      <w:r>
+        <w:rPr>
+          <w:rFonts w:ascii="Times New Roman" w:hAnsi="Times New Roman" w:cs="Times New Roman"/>
+          <w:sz w:val="28"/>
+          <w:szCs w:val="28"/>
+          <w:lang w:val="ru-RU"/>
+        </w:rPr>
+        <w:t xml:space="preserve"> узнать его источники и эволюцию его мысли.</w:t>
+      </w:r>
+    </w:p>
+    <w:p>
+      <w:pPr>
+        <w:pStyle w:val="Heading2"/>
+        <w:rPr>
+          <w:lang w:val="ru-RU"/>
+        </w:rPr>
+      </w:pPr>
+      <w:r>
+        <w:rPr>
+          <w:lang w:val="ru-RU"/>
+        </w:rPr>
+        <w:t>Зачем нужна философия?</w:t>
+      </w:r>
+    </w:p>
+    <w:p>
+      <w:pPr>
+        <w:pStyle w:val="Heading3"/>
+        <w:rPr>
+          <w:lang w:val="ru-RU"/>
+        </w:rPr>
+      </w:pPr>
+      <w:r>
+        <w:rPr>
+          <w:lang w:val="ru-RU"/>
+        </w:rPr>
+        <w:t>Предмет философии</w:t>
+      </w:r>
+    </w:p>
+    <w:p>
+      <w:pPr>
+        <w:rPr>
+          <w:rFonts w:ascii="Times New Roman" w:hAnsi="Times New Roman" w:cs="Times New Roman"/>
+          <w:sz w:val="28"/>
+          <w:szCs w:val="28"/>
+          <w:lang w:val="ru-RU"/>
+        </w:rPr>
+      </w:pPr>
+      <w:r>
+        <w:rPr>
+          <w:rFonts w:ascii="Times New Roman" w:hAnsi="Times New Roman" w:cs="Times New Roman"/>
+          <w:sz w:val="28"/>
+          <w:szCs w:val="28"/>
+          <w:lang w:val="ru-RU"/>
+        </w:rPr>
+        <w:t xml:space="preserve">Предмет философии находится настолько близко к нам, что мы его не замечаем. Это то, что можно назвать </w:t>
+      </w:r>
+      <w:r>
+        <w:rPr>
+          <w:rFonts w:ascii="Times New Roman" w:hAnsi="Times New Roman" w:cs="Times New Roman"/>
+          <w:b/>
+          <w:bCs/>
+          <w:sz w:val="28"/>
+          <w:szCs w:val="28"/>
+          <w:lang w:val="ru-RU"/>
+        </w:rPr>
+        <w:t>моделью реальности</w:t>
+      </w:r>
+      <w:r>
+        <w:rPr>
+          <w:rFonts w:ascii="Times New Roman" w:hAnsi="Times New Roman" w:cs="Times New Roman"/>
+          <w:sz w:val="28"/>
+          <w:szCs w:val="28"/>
+          <w:lang w:val="ru-RU"/>
+        </w:rPr>
+        <w:t xml:space="preserve"> или </w:t>
+      </w:r>
+      <w:r>
+        <w:rPr>
+          <w:rFonts w:ascii="Times New Roman" w:hAnsi="Times New Roman" w:cs="Times New Roman"/>
+          <w:b/>
+          <w:bCs/>
+          <w:sz w:val="28"/>
+          <w:szCs w:val="28"/>
+          <w:lang w:val="ru-RU"/>
+        </w:rPr>
+        <w:t>картиной мира</w:t>
+      </w:r>
+      <w:r>
+        <w:rPr>
+          <w:rFonts w:ascii="Times New Roman" w:hAnsi="Times New Roman" w:cs="Times New Roman"/>
+          <w:sz w:val="28"/>
+          <w:szCs w:val="28"/>
+          <w:lang w:val="ru-RU"/>
+        </w:rPr>
+        <w:t xml:space="preserve"> — </w:t>
+      </w:r>
+      <w:r>
+        <w:rPr>
+          <w:rFonts w:ascii="Times New Roman" w:hAnsi="Times New Roman" w:cs="Times New Roman"/>
+          <w:sz w:val="28"/>
+          <w:szCs w:val="28"/>
+          <w:lang w:val="ru-RU"/>
+        </w:rPr>
+        <w:t>фундаментальные вопросы, на которые мы должны ответить, чтобы формировать сложные социальные стратегии.</w:t>
+      </w:r>
+      <w:r>
+        <w:rPr>
+          <w:rFonts w:ascii="Times New Roman" w:hAnsi="Times New Roman" w:cs="Times New Roman"/>
+          <w:sz w:val="28"/>
+          <w:szCs w:val="28"/>
+          <w:lang w:val="ru-RU"/>
+        </w:rPr>
+        <w:t xml:space="preserve"> </w:t>
+      </w:r>
+      <w:r>
+        <w:rPr>
+          <w:rFonts w:ascii="Times New Roman" w:hAnsi="Times New Roman" w:cs="Times New Roman"/>
+          <w:sz w:val="28"/>
+          <w:szCs w:val="28"/>
+          <w:lang w:val="ru-RU"/>
+        </w:rPr>
+        <w:t xml:space="preserve">Первая </w:t>
+      </w:r>
+      <w:r>
+        <w:rPr>
+          <w:rFonts w:ascii="Times New Roman" w:hAnsi="Times New Roman" w:cs="Times New Roman"/>
+          <w:i/>
+          <w:iCs/>
+          <w:sz w:val="28"/>
+          <w:szCs w:val="28"/>
+          <w:lang w:val="ru-RU"/>
+        </w:rPr>
+        <w:t>модель реальности</w:t>
+      </w:r>
+      <w:r>
+        <w:rPr>
+          <w:rFonts w:ascii="Times New Roman" w:hAnsi="Times New Roman" w:cs="Times New Roman"/>
+          <w:sz w:val="28"/>
+          <w:szCs w:val="28"/>
+          <w:lang w:val="ru-RU"/>
+        </w:rPr>
+        <w:t xml:space="preserve"> была получена нами, </w:t>
+      </w:r>
+      <w:r>
+        <w:rPr>
+          <w:rFonts w:ascii="Times New Roman" w:hAnsi="Times New Roman" w:cs="Times New Roman"/>
+          <w:sz w:val="28"/>
+          <w:szCs w:val="28"/>
+          <w:lang w:val="ru-RU"/>
+        </w:rPr>
+        <w:t xml:space="preserve">буквально </w:t>
+      </w:r>
+      <w:r>
+        <w:rPr>
+          <w:rFonts w:ascii="Times New Roman" w:hAnsi="Times New Roman" w:cs="Times New Roman"/>
+          <w:sz w:val="28"/>
+          <w:szCs w:val="28"/>
+          <w:lang w:val="ru-RU"/>
+        </w:rPr>
+        <w:t xml:space="preserve">встроена в нас, </w:t>
+      </w:r>
+      <w:r>
+        <w:rPr>
+          <w:rFonts w:ascii="Times New Roman" w:hAnsi="Times New Roman" w:cs="Times New Roman"/>
+          <w:sz w:val="28"/>
+          <w:szCs w:val="28"/>
+          <w:lang w:val="ru-RU"/>
+        </w:rPr>
+        <w:t xml:space="preserve">в детстве, </w:t>
+      </w:r>
+      <w:r>
+        <w:rPr>
+          <w:rFonts w:ascii="Times New Roman" w:hAnsi="Times New Roman" w:cs="Times New Roman"/>
+          <w:sz w:val="28"/>
+          <w:szCs w:val="28"/>
+          <w:lang w:val="ru-RU"/>
+        </w:rPr>
+        <w:t>в процессе социализации.</w:t>
+      </w:r>
+    </w:p>
+    <w:p>
+      <w:pPr>
+        <w:pStyle w:val="Heading3"/>
+        <w:rPr>
+          <w:lang w:val="ru-RU"/>
+        </w:rPr>
+      </w:pPr>
+      <w:r>
+        <w:rPr>
+          <w:lang w:val="ru-RU"/>
+        </w:rPr>
+        <w:lastRenderedPageBreak/>
         <w:t>Два фундаментальных вопроса</w:t>
+      </w:r>
+      <w:r>
+        <w:rPr>
+          <w:lang w:val="ru-RU"/>
+        </w:rPr>
+        <w:t xml:space="preserve"> философии</w:t>
+      </w:r>
+    </w:p>
+    <w:p>
+      <w:pPr>
+        <w:rPr>
+          <w:rFonts w:ascii="Times New Roman" w:hAnsi="Times New Roman" w:cs="Times New Roman"/>
+          <w:sz w:val="28"/>
+          <w:szCs w:val="28"/>
+          <w:lang w:val="ru-RU"/>
+        </w:rPr>
+      </w:pPr>
+      <w:r>
+        <w:rPr>
+          <w:rFonts w:ascii="Times New Roman" w:hAnsi="Times New Roman" w:cs="Times New Roman"/>
+          <w:sz w:val="28"/>
+          <w:szCs w:val="28"/>
+          <w:lang w:val="ru-RU"/>
+        </w:rPr>
+        <w:t>Г</w:t>
+      </w:r>
+      <w:r>
+        <w:rPr>
+          <w:rFonts w:ascii="Times New Roman" w:hAnsi="Times New Roman" w:cs="Times New Roman"/>
+          <w:sz w:val="28"/>
+          <w:szCs w:val="28"/>
+          <w:lang w:val="ru-RU"/>
+        </w:rPr>
+        <w:t>лавн</w:t>
+      </w:r>
+      <w:r>
+        <w:rPr>
+          <w:rFonts w:ascii="Times New Roman" w:hAnsi="Times New Roman" w:cs="Times New Roman"/>
+          <w:sz w:val="28"/>
+          <w:szCs w:val="28"/>
+          <w:lang w:val="ru-RU"/>
+        </w:rPr>
+        <w:t>ые</w:t>
+      </w:r>
+      <w:r>
+        <w:rPr>
+          <w:rFonts w:ascii="Times New Roman" w:hAnsi="Times New Roman" w:cs="Times New Roman"/>
+          <w:sz w:val="28"/>
+          <w:szCs w:val="28"/>
+          <w:lang w:val="ru-RU"/>
+        </w:rPr>
+        <w:t xml:space="preserve"> вопрос</w:t>
+      </w:r>
+      <w:r>
+        <w:rPr>
+          <w:rFonts w:ascii="Times New Roman" w:hAnsi="Times New Roman" w:cs="Times New Roman"/>
+          <w:sz w:val="28"/>
+          <w:szCs w:val="28"/>
+          <w:lang w:val="ru-RU"/>
+        </w:rPr>
+        <w:t>ы</w:t>
+      </w:r>
+      <w:r>
+        <w:rPr>
+          <w:rFonts w:ascii="Times New Roman" w:hAnsi="Times New Roman" w:cs="Times New Roman"/>
+          <w:sz w:val="28"/>
+          <w:szCs w:val="28"/>
+          <w:lang w:val="ru-RU"/>
+        </w:rPr>
+        <w:t xml:space="preserve">, которыми </w:t>
+      </w:r>
+      <w:r>
+        <w:rPr>
+          <w:rFonts w:ascii="Times New Roman" w:hAnsi="Times New Roman" w:cs="Times New Roman"/>
+          <w:sz w:val="28"/>
+          <w:szCs w:val="28"/>
+          <w:lang w:val="ru-RU"/>
+        </w:rPr>
+        <w:t xml:space="preserve">задается </w:t>
+      </w:r>
+      <w:r>
+        <w:rPr>
+          <w:rFonts w:ascii="Times New Roman" w:hAnsi="Times New Roman" w:cs="Times New Roman"/>
+          <w:sz w:val="28"/>
+          <w:szCs w:val="28"/>
+          <w:lang w:val="ru-RU"/>
+        </w:rPr>
+        <w:t>человек</w:t>
+      </w:r>
+      <w:r>
+        <w:rPr>
+          <w:rFonts w:ascii="Times New Roman" w:hAnsi="Times New Roman" w:cs="Times New Roman"/>
+          <w:sz w:val="28"/>
+          <w:szCs w:val="28"/>
+          <w:lang w:val="ru-RU"/>
+        </w:rPr>
+        <w:t xml:space="preserve"> на протяжении всей своей истории, звучат так:</w:t>
       </w:r>
     </w:p>
     <w:p>
@@ -78,9 +733,35 @@
           <w:ilvl w:val="0"/>
           <w:numId w:val="1"/>
         </w:numPr>
-      </w:pPr>
-      <w:r>
-        <w:t>Кто я?</w:t>
+        <w:rPr>
+          <w:rFonts w:ascii="Times New Roman" w:hAnsi="Times New Roman" w:cs="Times New Roman"/>
+          <w:b/>
+          <w:bCs/>
+          <w:sz w:val="28"/>
+          <w:szCs w:val="28"/>
+        </w:rPr>
+      </w:pPr>
+      <w:proofErr w:type="spellStart"/>
+      <w:r>
+        <w:rPr>
+          <w:rFonts w:ascii="Times New Roman" w:hAnsi="Times New Roman" w:cs="Times New Roman"/>
+          <w:b/>
+          <w:bCs/>
+          <w:sz w:val="28"/>
+          <w:szCs w:val="28"/>
+        </w:rPr>
+        <w:t>Где</w:t>
+      </w:r>
+      <w:proofErr w:type="spellEnd"/>
+      <w:r>
+        <w:rPr>
+          <w:rFonts w:ascii="Times New Roman" w:hAnsi="Times New Roman" w:cs="Times New Roman"/>
+          <w:b/>
+          <w:bCs/>
+          <w:sz w:val="28"/>
+          <w:szCs w:val="28"/>
+        </w:rPr>
+        <w:t xml:space="preserve"> я?</w:t>
       </w:r>
     </w:p>
     <w:p>
@@ -89,20 +770,614 @@
           <w:ilvl w:val="0"/>
           <w:numId w:val="1"/>
         </w:numPr>
-      </w:pPr>
-      <w:r>
-        <w:t>Где я?</w:t>
+        <w:rPr>
+          <w:rFonts w:ascii="Times New Roman" w:hAnsi="Times New Roman" w:cs="Times New Roman"/>
+          <w:b/>
+          <w:bCs/>
+          <w:sz w:val="28"/>
+          <w:szCs w:val="28"/>
+        </w:rPr>
+      </w:pPr>
+      <w:proofErr w:type="spellStart"/>
+      <w:r>
+        <w:rPr>
+          <w:rFonts w:ascii="Times New Roman" w:hAnsi="Times New Roman" w:cs="Times New Roman"/>
+          <w:b/>
+          <w:bCs/>
+          <w:sz w:val="28"/>
+          <w:szCs w:val="28"/>
+        </w:rPr>
+        <w:t>Кто</w:t>
+      </w:r>
+      <w:proofErr w:type="spellEnd"/>
+      <w:r>
+        <w:rPr>
+          <w:rFonts w:ascii="Times New Roman" w:hAnsi="Times New Roman" w:cs="Times New Roman"/>
+          <w:b/>
+          <w:bCs/>
+          <w:sz w:val="28"/>
+          <w:szCs w:val="28"/>
+        </w:rPr>
+        <w:t xml:space="preserve"> я?</w:t>
       </w:r>
     </w:p>
     <w:p>
-      <w:r>
-        <w:t>Люди приходят к мудрецам, которые отвечают им на эти два вопроса. Но философ не мудрец. Он берет готовую картину мира и подвергает ее «краш-тесту» — подвергает её критике, ставит под сомнение.</w:t>
+      <w:pPr>
+        <w:rPr>
+          <w:rFonts w:ascii="Times New Roman" w:hAnsi="Times New Roman" w:cs="Times New Roman"/>
+          <w:sz w:val="28"/>
+          <w:szCs w:val="28"/>
+          <w:lang w:val="ru-RU"/>
+        </w:rPr>
+      </w:pPr>
+      <w:r>
+        <w:rPr>
+          <w:rFonts w:ascii="Times New Roman" w:hAnsi="Times New Roman" w:cs="Times New Roman"/>
+          <w:sz w:val="28"/>
+          <w:szCs w:val="28"/>
+          <w:lang w:val="ru-RU"/>
+        </w:rPr>
+        <w:t>В поисках ответов л</w:t>
+      </w:r>
+      <w:r>
+        <w:rPr>
+          <w:rFonts w:ascii="Times New Roman" w:hAnsi="Times New Roman" w:cs="Times New Roman"/>
+          <w:sz w:val="28"/>
+          <w:szCs w:val="28"/>
+          <w:lang w:val="ru-RU"/>
+        </w:rPr>
+        <w:t xml:space="preserve">юди </w:t>
+      </w:r>
+      <w:r>
+        <w:rPr>
+          <w:rFonts w:ascii="Times New Roman" w:hAnsi="Times New Roman" w:cs="Times New Roman"/>
+          <w:sz w:val="28"/>
+          <w:szCs w:val="28"/>
+          <w:lang w:val="ru-RU"/>
+        </w:rPr>
+        <w:t xml:space="preserve">испокон веков </w:t>
+      </w:r>
+      <w:r>
+        <w:rPr>
+          <w:rFonts w:ascii="Times New Roman" w:hAnsi="Times New Roman" w:cs="Times New Roman"/>
+          <w:sz w:val="28"/>
+          <w:szCs w:val="28"/>
+          <w:lang w:val="ru-RU"/>
+        </w:rPr>
+        <w:t>приходят к мудрецам.</w:t>
+      </w:r>
+      <w:r>
+        <w:rPr>
+          <w:rFonts w:ascii="Times New Roman" w:hAnsi="Times New Roman" w:cs="Times New Roman"/>
+          <w:sz w:val="28"/>
+          <w:szCs w:val="28"/>
+          <w:lang w:val="ru-RU"/>
+        </w:rPr>
+        <w:t xml:space="preserve"> </w:t>
+      </w:r>
+      <w:r>
+        <w:rPr>
+          <w:rFonts w:ascii="Times New Roman" w:hAnsi="Times New Roman" w:cs="Times New Roman"/>
+          <w:sz w:val="28"/>
+          <w:szCs w:val="28"/>
+          <w:lang w:val="ru-RU"/>
+        </w:rPr>
+        <w:t xml:space="preserve"> Мудрец в древней культуре – это социальная функция, профессионал, который </w:t>
+      </w:r>
+      <w:r>
+        <w:rPr>
+          <w:rFonts w:ascii="Times New Roman" w:hAnsi="Times New Roman" w:cs="Times New Roman"/>
+          <w:sz w:val="28"/>
+          <w:szCs w:val="28"/>
+          <w:lang w:val="ru-RU"/>
+        </w:rPr>
+        <w:t xml:space="preserve">должен </w:t>
+      </w:r>
+      <w:r>
+        <w:rPr>
+          <w:rFonts w:ascii="Times New Roman" w:hAnsi="Times New Roman" w:cs="Times New Roman"/>
+          <w:sz w:val="28"/>
+          <w:szCs w:val="28"/>
+          <w:lang w:val="ru-RU"/>
+        </w:rPr>
+        <w:t>отвеча</w:t>
+      </w:r>
+      <w:r>
+        <w:rPr>
+          <w:rFonts w:ascii="Times New Roman" w:hAnsi="Times New Roman" w:cs="Times New Roman"/>
+          <w:sz w:val="28"/>
+          <w:szCs w:val="28"/>
+          <w:lang w:val="ru-RU"/>
+        </w:rPr>
+        <w:t xml:space="preserve">ть </w:t>
+      </w:r>
+      <w:r>
+        <w:rPr>
+          <w:rFonts w:ascii="Times New Roman" w:hAnsi="Times New Roman" w:cs="Times New Roman"/>
+          <w:sz w:val="28"/>
+          <w:szCs w:val="28"/>
+          <w:lang w:val="ru-RU"/>
+        </w:rPr>
+        <w:t>на</w:t>
+      </w:r>
+      <w:r>
+        <w:rPr>
+          <w:rFonts w:ascii="Times New Roman" w:hAnsi="Times New Roman" w:cs="Times New Roman"/>
+          <w:sz w:val="28"/>
+          <w:szCs w:val="28"/>
+          <w:lang w:val="ru-RU"/>
+        </w:rPr>
+        <w:t xml:space="preserve"> эти</w:t>
+      </w:r>
+      <w:r>
+        <w:rPr>
+          <w:rFonts w:ascii="Times New Roman" w:hAnsi="Times New Roman" w:cs="Times New Roman"/>
+          <w:sz w:val="28"/>
+          <w:szCs w:val="28"/>
+          <w:lang w:val="ru-RU"/>
+        </w:rPr>
+        <w:t xml:space="preserve"> вопросы. </w:t>
+      </w:r>
+      <w:r>
+        <w:rPr>
+          <w:rFonts w:ascii="Times New Roman" w:hAnsi="Times New Roman" w:cs="Times New Roman"/>
+          <w:sz w:val="28"/>
+          <w:szCs w:val="28"/>
+          <w:lang w:val="ru-RU"/>
+        </w:rPr>
+        <w:t>Мудрец</w:t>
+      </w:r>
+      <w:r>
+        <w:rPr>
+          <w:rFonts w:ascii="Times New Roman" w:hAnsi="Times New Roman" w:cs="Times New Roman"/>
+          <w:sz w:val="28"/>
+          <w:szCs w:val="28"/>
+          <w:lang w:val="ru-RU"/>
+        </w:rPr>
+        <w:t xml:space="preserve"> поддерживает картину мира, полученную в результате социализации.</w:t>
+      </w:r>
+      <w:r>
+        <w:rPr>
+          <w:rFonts w:ascii="Times New Roman" w:hAnsi="Times New Roman" w:cs="Times New Roman"/>
+          <w:sz w:val="28"/>
+          <w:szCs w:val="28"/>
+          <w:lang w:val="ru-RU"/>
+        </w:rPr>
+        <w:t xml:space="preserve"> </w:t>
+      </w:r>
+      <w:r>
+        <w:rPr>
+          <w:rFonts w:ascii="Times New Roman" w:hAnsi="Times New Roman" w:cs="Times New Roman"/>
+          <w:sz w:val="28"/>
+          <w:szCs w:val="28"/>
+          <w:lang w:val="ru-RU"/>
+        </w:rPr>
+        <w:t xml:space="preserve">Но философ </w:t>
+      </w:r>
+      <w:r>
+        <w:rPr>
+          <w:rFonts w:ascii="Times New Roman" w:hAnsi="Times New Roman" w:cs="Times New Roman"/>
+          <w:sz w:val="28"/>
+          <w:szCs w:val="28"/>
+          <w:lang w:val="ru-RU"/>
+        </w:rPr>
+        <w:t xml:space="preserve">— </w:t>
+      </w:r>
+      <w:r>
+        <w:rPr>
+          <w:rFonts w:ascii="Times New Roman" w:hAnsi="Times New Roman" w:cs="Times New Roman"/>
+          <w:sz w:val="28"/>
+          <w:szCs w:val="28"/>
+          <w:lang w:val="ru-RU"/>
+        </w:rPr>
+        <w:t>не мудрец.</w:t>
+      </w:r>
+      <w:r>
+        <w:rPr>
+          <w:lang w:val="ru-RU"/>
+        </w:rPr>
+        <w:t xml:space="preserve"> </w:t>
+      </w:r>
+      <w:r>
+        <w:rPr>
+          <w:rFonts w:ascii="Times New Roman" w:hAnsi="Times New Roman" w:cs="Times New Roman"/>
+          <w:sz w:val="28"/>
+          <w:szCs w:val="28"/>
+          <w:lang w:val="ru-RU"/>
+        </w:rPr>
+        <w:t>Философ, в отличие от мудреца, занимается ровно обратным — он</w:t>
+      </w:r>
+      <w:r>
+        <w:rPr>
+          <w:rFonts w:ascii="Times New Roman" w:hAnsi="Times New Roman" w:cs="Times New Roman"/>
+          <w:sz w:val="28"/>
+          <w:szCs w:val="28"/>
+          <w:lang w:val="ru-RU"/>
+        </w:rPr>
+        <w:t xml:space="preserve"> берет готовую картину мира и подвергает ее </w:t>
+      </w:r>
+      <w:r>
+        <w:rPr>
+          <w:rFonts w:ascii="Times New Roman" w:hAnsi="Times New Roman" w:cs="Times New Roman"/>
+          <w:i/>
+          <w:iCs/>
+          <w:sz w:val="28"/>
+          <w:szCs w:val="28"/>
+          <w:lang w:val="ru-RU"/>
+        </w:rPr>
+        <w:t>краш-тесту</w:t>
+      </w:r>
+      <w:r>
+        <w:rPr>
+          <w:rFonts w:ascii="Times New Roman" w:hAnsi="Times New Roman" w:cs="Times New Roman"/>
+          <w:sz w:val="28"/>
+          <w:szCs w:val="28"/>
+          <w:lang w:val="ru-RU"/>
+        </w:rPr>
+        <w:t xml:space="preserve">, </w:t>
+      </w:r>
+      <w:r>
+        <w:rPr>
+          <w:rFonts w:ascii="Times New Roman" w:hAnsi="Times New Roman" w:cs="Times New Roman"/>
+          <w:sz w:val="28"/>
+          <w:szCs w:val="28"/>
+          <w:lang w:val="ru-RU"/>
+        </w:rPr>
+        <w:t>критике, ставит под</w:t>
+      </w:r>
+      <w:r>
+        <w:rPr>
+          <w:rFonts w:ascii="Times New Roman" w:hAnsi="Times New Roman" w:cs="Times New Roman"/>
+          <w:sz w:val="28"/>
+          <w:szCs w:val="28"/>
+          <w:lang w:val="ru-RU"/>
+        </w:rPr>
+        <w:t xml:space="preserve"> её под</w:t>
+      </w:r>
+      <w:r>
+        <w:rPr>
+          <w:rFonts w:ascii="Times New Roman" w:hAnsi="Times New Roman" w:cs="Times New Roman"/>
+          <w:sz w:val="28"/>
+          <w:szCs w:val="28"/>
+          <w:lang w:val="ru-RU"/>
+        </w:rPr>
+        <w:t xml:space="preserve"> сомнение.</w:t>
       </w:r>
     </w:p>
     <w:p>
-      <w:r>
-        <w:t>Метод проверки очень схож с математикой: исходя из аксиомы, философия строит теории (наподобие математических теорем), пытается решить проблемы, доказав, что данная картина мира себе не противоречит. Если в картине мира находятся противоречия, начинается период скептицизма, оканчивающийся сменой картины мира — результат философии. Мысли философии устремлены далеко в будущее и являются некоторым прогнозом.</w:t>
-      </w:r>
+      <w:pPr>
+        <w:pStyle w:val="Quote"/>
+        <w:rPr>
+          <w:lang w:val="ru-RU"/>
+        </w:rPr>
+      </w:pPr>
+      <w:r>
+        <w:rPr>
+          <w:lang w:val="ru-RU"/>
+        </w:rPr>
+        <w:t>Слово философия</w:t>
+      </w:r>
+      <w:r>
+        <w:rPr>
+          <w:lang w:val="ru-RU"/>
+        </w:rPr>
+        <w:t xml:space="preserve"> </w:t>
+      </w:r>
+      <w:r>
+        <w:rPr>
+          <w:lang w:val="ru-RU"/>
+        </w:rPr>
+        <w:t>впервые появилось в легенде о Пифагоре. Когда правитель города назвал его мудрейшим, Пифагор ответил, что он не мудрец, а философ (</w:t>
+      </w:r>
+      <w:proofErr w:type="spellStart"/>
+      <w:r>
+        <w:rPr>
+          <w:lang w:val="ru-RU"/>
+        </w:rPr>
+        <w:t>φιλόσοφος</w:t>
+      </w:r>
+      <w:proofErr w:type="spellEnd"/>
+      <w:r>
+        <w:rPr>
+          <w:lang w:val="ru-RU"/>
+        </w:rPr>
+        <w:t xml:space="preserve"> – любомудр, любящий мудрость).</w:t>
+      </w:r>
+    </w:p>
+    <w:p>
+      <w:pPr>
+        <w:pStyle w:val="Heading3"/>
+        <w:rPr>
+          <w:lang w:val="ru-RU"/>
+        </w:rPr>
+      </w:pPr>
+      <w:r>
+        <w:rPr>
+          <w:lang w:val="ru-RU"/>
+        </w:rPr>
+        <w:t>Философия и математика</w:t>
+      </w:r>
+    </w:p>
+    <w:p>
+      <w:pPr>
+        <w:rPr>
+          <w:rFonts w:ascii="Times New Roman" w:hAnsi="Times New Roman" w:cs="Times New Roman"/>
+          <w:sz w:val="28"/>
+          <w:szCs w:val="28"/>
+          <w:lang w:val="ru-RU"/>
+        </w:rPr>
+      </w:pPr>
+      <w:r>
+        <w:rPr>
+          <w:rFonts w:ascii="Times New Roman" w:hAnsi="Times New Roman" w:cs="Times New Roman"/>
+          <w:sz w:val="28"/>
+          <w:szCs w:val="28"/>
+          <w:lang w:val="ru-RU"/>
+        </w:rPr>
+        <w:t>Пифагор</w:t>
+      </w:r>
+      <w:r>
+        <w:rPr>
+          <w:rFonts w:ascii="Times New Roman" w:hAnsi="Times New Roman" w:cs="Times New Roman"/>
+          <w:sz w:val="28"/>
+          <w:szCs w:val="28"/>
+          <w:lang w:val="ru-RU"/>
+        </w:rPr>
+        <w:t xml:space="preserve"> </w:t>
+      </w:r>
+      <w:r>
+        <w:rPr>
+          <w:rFonts w:ascii="Times New Roman" w:hAnsi="Times New Roman" w:cs="Times New Roman"/>
+          <w:sz w:val="28"/>
+          <w:szCs w:val="28"/>
+          <w:lang w:val="ru-RU"/>
+        </w:rPr>
+        <w:t xml:space="preserve">известен </w:t>
+      </w:r>
+      <w:r>
+        <w:rPr>
+          <w:rFonts w:ascii="Times New Roman" w:hAnsi="Times New Roman" w:cs="Times New Roman"/>
+          <w:sz w:val="28"/>
+          <w:szCs w:val="28"/>
+          <w:lang w:val="ru-RU"/>
+        </w:rPr>
+        <w:t xml:space="preserve">прежде всего не </w:t>
+      </w:r>
+      <w:r>
+        <w:rPr>
+          <w:rFonts w:ascii="Times New Roman" w:hAnsi="Times New Roman" w:cs="Times New Roman"/>
+          <w:sz w:val="28"/>
+          <w:szCs w:val="28"/>
+          <w:lang w:val="ru-RU"/>
+        </w:rPr>
+        <w:t>как философ, но как математик</w:t>
+      </w:r>
+      <w:r>
+        <w:rPr>
+          <w:rFonts w:ascii="Times New Roman" w:hAnsi="Times New Roman" w:cs="Times New Roman"/>
+          <w:sz w:val="28"/>
+          <w:szCs w:val="28"/>
+          <w:lang w:val="ru-RU"/>
+        </w:rPr>
+        <w:t xml:space="preserve">, и это не с проста. </w:t>
+      </w:r>
+      <w:r>
+        <w:rPr>
+          <w:rFonts w:ascii="Times New Roman" w:hAnsi="Times New Roman" w:cs="Times New Roman"/>
+          <w:sz w:val="28"/>
+          <w:szCs w:val="28"/>
+          <w:lang w:val="ru-RU"/>
+        </w:rPr>
+        <w:t>На заре</w:t>
+      </w:r>
+      <w:r>
+        <w:rPr>
+          <w:rFonts w:ascii="Times New Roman" w:hAnsi="Times New Roman" w:cs="Times New Roman"/>
+          <w:sz w:val="28"/>
+          <w:szCs w:val="28"/>
+          <w:lang w:val="ru-RU"/>
+        </w:rPr>
+        <w:t xml:space="preserve"> возникновени</w:t>
+      </w:r>
+      <w:r>
+        <w:rPr>
+          <w:rFonts w:ascii="Times New Roman" w:hAnsi="Times New Roman" w:cs="Times New Roman"/>
+          <w:sz w:val="28"/>
+          <w:szCs w:val="28"/>
+          <w:lang w:val="ru-RU"/>
+        </w:rPr>
+        <w:t xml:space="preserve">я </w:t>
+      </w:r>
+      <w:r>
+        <w:rPr>
+          <w:rFonts w:ascii="Times New Roman" w:hAnsi="Times New Roman" w:cs="Times New Roman"/>
+          <w:sz w:val="28"/>
+          <w:szCs w:val="28"/>
+          <w:lang w:val="ru-RU"/>
+        </w:rPr>
+        <w:t>философии и математики между ними существовала тесная связь. Пифагорейство – это синтез математических знаний, философских идей и мифологии.</w:t>
+      </w:r>
+    </w:p>
+    <w:p>
+      <w:pPr>
+        <w:rPr>
+          <w:rFonts w:ascii="Times New Roman" w:hAnsi="Times New Roman" w:cs="Times New Roman"/>
+          <w:sz w:val="28"/>
+          <w:szCs w:val="28"/>
+          <w:lang w:val="ru-RU"/>
+        </w:rPr>
+      </w:pPr>
+      <w:r>
+        <w:rPr>
+          <w:rFonts w:ascii="Times New Roman" w:hAnsi="Times New Roman" w:cs="Times New Roman"/>
+          <w:sz w:val="28"/>
+          <w:szCs w:val="28"/>
+          <w:lang w:val="ru-RU"/>
+        </w:rPr>
+        <w:t xml:space="preserve">Метод </w:t>
+      </w:r>
+      <w:r>
+        <w:rPr>
+          <w:rFonts w:ascii="Times New Roman" w:hAnsi="Times New Roman" w:cs="Times New Roman"/>
+          <w:sz w:val="28"/>
+          <w:szCs w:val="28"/>
+          <w:lang w:val="ru-RU"/>
+        </w:rPr>
+        <w:t xml:space="preserve">проверки </w:t>
+      </w:r>
+      <w:r>
+        <w:rPr>
+          <w:rFonts w:ascii="Times New Roman" w:hAnsi="Times New Roman" w:cs="Times New Roman"/>
+          <w:sz w:val="28"/>
+          <w:szCs w:val="28"/>
+          <w:lang w:val="ru-RU"/>
+        </w:rPr>
+        <w:t xml:space="preserve">философских идей </w:t>
+      </w:r>
+      <w:r>
+        <w:rPr>
+          <w:rFonts w:ascii="Times New Roman" w:hAnsi="Times New Roman" w:cs="Times New Roman"/>
+          <w:sz w:val="28"/>
+          <w:szCs w:val="28"/>
+          <w:lang w:val="ru-RU"/>
+        </w:rPr>
+        <w:t>очень схож с математи</w:t>
+      </w:r>
+      <w:r>
+        <w:rPr>
+          <w:rFonts w:ascii="Times New Roman" w:hAnsi="Times New Roman" w:cs="Times New Roman"/>
+          <w:sz w:val="28"/>
+          <w:szCs w:val="28"/>
+          <w:lang w:val="ru-RU"/>
+        </w:rPr>
+        <w:t>ческим</w:t>
+      </w:r>
+      <w:r>
+        <w:rPr>
+          <w:rFonts w:ascii="Times New Roman" w:hAnsi="Times New Roman" w:cs="Times New Roman"/>
+          <w:sz w:val="28"/>
+          <w:szCs w:val="28"/>
+          <w:lang w:val="ru-RU"/>
+        </w:rPr>
+        <w:t xml:space="preserve">: исходя из </w:t>
+      </w:r>
+      <w:r>
+        <w:rPr>
+          <w:rFonts w:ascii="Times New Roman" w:hAnsi="Times New Roman" w:cs="Times New Roman"/>
+          <w:i/>
+          <w:iCs/>
+          <w:sz w:val="28"/>
+          <w:szCs w:val="28"/>
+          <w:lang w:val="ru-RU"/>
+        </w:rPr>
+        <w:t>аксиомы</w:t>
+      </w:r>
+      <w:r>
+        <w:rPr>
+          <w:rFonts w:ascii="Times New Roman" w:hAnsi="Times New Roman" w:cs="Times New Roman"/>
+          <w:sz w:val="28"/>
+          <w:szCs w:val="28"/>
+          <w:lang w:val="ru-RU"/>
+        </w:rPr>
+        <w:t xml:space="preserve">, философия строит </w:t>
+      </w:r>
+      <w:r>
+        <w:rPr>
+          <w:rFonts w:ascii="Times New Roman" w:hAnsi="Times New Roman" w:cs="Times New Roman"/>
+          <w:i/>
+          <w:iCs/>
+          <w:sz w:val="28"/>
+          <w:szCs w:val="28"/>
+          <w:lang w:val="ru-RU"/>
+        </w:rPr>
+        <w:t>теории</w:t>
+      </w:r>
+      <w:r>
+        <w:rPr>
+          <w:rFonts w:ascii="Times New Roman" w:hAnsi="Times New Roman" w:cs="Times New Roman"/>
+          <w:sz w:val="28"/>
+          <w:szCs w:val="28"/>
+          <w:lang w:val="ru-RU"/>
+        </w:rPr>
+        <w:t xml:space="preserve"> наподобие математических теорем, пытается решить проблемы</w:t>
+      </w:r>
+      <w:r>
+        <w:rPr>
+          <w:rFonts w:ascii="Times New Roman" w:hAnsi="Times New Roman" w:cs="Times New Roman"/>
+          <w:sz w:val="28"/>
+          <w:szCs w:val="28"/>
+          <w:lang w:val="ru-RU"/>
+        </w:rPr>
+        <w:t xml:space="preserve">, доказав, что </w:t>
+      </w:r>
+      <w:r>
+        <w:rPr>
+          <w:rFonts w:ascii="Times New Roman" w:hAnsi="Times New Roman" w:cs="Times New Roman"/>
+          <w:sz w:val="28"/>
+          <w:szCs w:val="28"/>
+          <w:lang w:val="ru-RU"/>
+        </w:rPr>
+        <w:t>текущая</w:t>
+      </w:r>
+      <w:r>
+        <w:rPr>
+          <w:rFonts w:ascii="Times New Roman" w:hAnsi="Times New Roman" w:cs="Times New Roman"/>
+          <w:sz w:val="28"/>
+          <w:szCs w:val="28"/>
+          <w:lang w:val="ru-RU"/>
+        </w:rPr>
+        <w:t xml:space="preserve"> картина мира себе не противоречит. </w:t>
+      </w:r>
+      <w:r>
+        <w:rPr>
+          <w:rFonts w:ascii="Times New Roman" w:hAnsi="Times New Roman" w:cs="Times New Roman"/>
+          <w:sz w:val="28"/>
+          <w:szCs w:val="28"/>
+          <w:lang w:val="ru-RU"/>
+        </w:rPr>
+        <w:t>Результат философской деятельности – это констатация того, есть ли в текущей картине мира неразрешимые противоречия. Если такие противоречия есть, то картина мира обречена на крах. Симптом приближающегося краха – распространение различных форм скептицизма</w:t>
+      </w:r>
+      <w:r>
+        <w:rPr>
+          <w:rFonts w:ascii="Times New Roman" w:hAnsi="Times New Roman" w:cs="Times New Roman"/>
+          <w:sz w:val="28"/>
+          <w:szCs w:val="28"/>
+          <w:lang w:val="ru-RU"/>
+        </w:rPr>
+        <w:t>.</w:t>
+      </w:r>
+    </w:p>
+    <w:p>
+      <w:pPr>
+        <w:rPr>
+          <w:rFonts w:ascii="Times New Roman" w:hAnsi="Times New Roman" w:cs="Times New Roman"/>
+          <w:sz w:val="28"/>
+          <w:szCs w:val="28"/>
+          <w:u w:val="thick"/>
+          <w:lang w:val="ru-RU"/>
+        </w:rPr>
+      </w:pPr>
+      <w:r>
+        <w:rPr>
+          <w:rFonts w:ascii="Times New Roman" w:hAnsi="Times New Roman" w:cs="Times New Roman"/>
+          <w:sz w:val="28"/>
+          <w:szCs w:val="28"/>
+          <w:u w:val="thick"/>
+          <w:lang w:val="ru-RU"/>
+        </w:rPr>
+        <w:t>Философия – это не история бородатых мудрецов, а прогноз, устремленный в будущее, причем в очень далекое будущее.</w:t>
+      </w:r>
+    </w:p>
+    <w:p>
+      <w:pPr>
+        <w:rPr>
+          <w:rFonts w:ascii="Times New Roman" w:hAnsi="Times New Roman" w:cs="Times New Roman"/>
+          <w:sz w:val="28"/>
+          <w:szCs w:val="28"/>
+          <w:u w:val="single"/>
+          <w:lang w:val="ru-RU"/>
+        </w:rPr>
+      </w:pPr>
     </w:p>
     <w:sectPr>
       <w:pgSz w:w="12240" w:h="15840"/>
@@ -958,6 +2233,205 @@
       <w:numFmt w:val="decimal"/>
       <w:lvlText w:val=""/>
       <w:lvlJc w:val="left"/>
+    </w:lvl>
+  </w:abstractNum>
+  <w:abstractNum w:abstractNumId="13" w15:restartNumberingAfterBreak="0">
+    <w:nsid w:val="20CB3BA1"/>
+    <w:multiLevelType w:val="multilevel"/>
+    <w:tmpl w:val="8CB8F1E4"/>
+    <w:lvl w:ilvl="0">
+      <w:start w:val="1"/>
+      <w:numFmt w:val="decimal"/>
+      <w:lvlText w:val="%1."/>
+      <w:lvlJc w:val="left"/>
+      <w:pPr>
+        <w:tabs>
+          <w:tab w:val="num" w:pos="720"/>
+        </w:tabs>
+        <w:ind w:left="720" w:hanging="360"/>
+      </w:pPr>
+    </w:lvl>
+    <w:lvl w:ilvl="1" w:tentative="1">
+      <w:start w:val="1"/>
+      <w:numFmt w:val="decimal"/>
+      <w:lvlText w:val="%2."/>
+      <w:lvlJc w:val="left"/>
+      <w:pPr>
+        <w:tabs>
+          <w:tab w:val="num" w:pos="1440"/>
+        </w:tabs>
+        <w:ind w:left="1440" w:hanging="360"/>
+      </w:pPr>
+    </w:lvl>
+    <w:lvl w:ilvl="2" w:tentative="1">
+      <w:start w:val="1"/>
+      <w:numFmt w:val="decimal"/>
+      <w:lvlText w:val="%3."/>
+      <w:lvlJc w:val="left"/>
+      <w:pPr>
+        <w:tabs>
+          <w:tab w:val="num" w:pos="2160"/>
+        </w:tabs>
+        <w:ind w:left="2160" w:hanging="360"/>
+      </w:pPr>
+    </w:lvl>
+    <w:lvl w:ilvl="3" w:tentative="1">
+      <w:start w:val="1"/>
+      <w:numFmt w:val="decimal"/>
+      <w:lvlText w:val="%4."/>
+      <w:lvlJc w:val="left"/>
+      <w:pPr>
+        <w:tabs>
+          <w:tab w:val="num" w:pos="2880"/>
+        </w:tabs>
+        <w:ind w:left="2880" w:hanging="360"/>
+      </w:pPr>
+    </w:lvl>
+    <w:lvl w:ilvl="4" w:tentative="1">
+      <w:start w:val="1"/>
+      <w:numFmt w:val="decimal"/>
+      <w:lvlText w:val="%5."/>
+      <w:lvlJc w:val="left"/>
+      <w:pPr>
+        <w:tabs>
+          <w:tab w:val="num" w:pos="3600"/>
+        </w:tabs>
+        <w:ind w:left="3600" w:hanging="360"/>
+      </w:pPr>
+    </w:lvl>
+    <w:lvl w:ilvl="5" w:tentative="1">
+      <w:start w:val="1"/>
+      <w:numFmt w:val="decimal"/>
+      <w:lvlText w:val="%6."/>
+      <w:lvlJc w:val="left"/>
+      <w:pPr>
+        <w:tabs>
+          <w:tab w:val="num" w:pos="4320"/>
+        </w:tabs>
+        <w:ind w:left="4320" w:hanging="360"/>
+      </w:pPr>
+    </w:lvl>
+    <w:lvl w:ilvl="6" w:tentative="1">
+      <w:start w:val="1"/>
+      <w:numFmt w:val="decimal"/>
+      <w:lvlText w:val="%7."/>
+      <w:lvlJc w:val="left"/>
+      <w:pPr>
+        <w:tabs>
+          <w:tab w:val="num" w:pos="5040"/>
+        </w:tabs>
+        <w:ind w:left="5040" w:hanging="360"/>
+      </w:pPr>
+    </w:lvl>
+    <w:lvl w:ilvl="7" w:tentative="1">
+      <w:start w:val="1"/>
+      <w:numFmt w:val="decimal"/>
+      <w:lvlText w:val="%8."/>
+      <w:lvlJc w:val="left"/>
+      <w:pPr>
+        <w:tabs>
+          <w:tab w:val="num" w:pos="5760"/>
+        </w:tabs>
+        <w:ind w:left="5760" w:hanging="360"/>
+      </w:pPr>
+    </w:lvl>
+    <w:lvl w:ilvl="8" w:tentative="1">
+      <w:start w:val="1"/>
+      <w:numFmt w:val="decimal"/>
+      <w:lvlText w:val="%9."/>
+      <w:lvlJc w:val="left"/>
+      <w:pPr>
+        <w:tabs>
+          <w:tab w:val="num" w:pos="6480"/>
+        </w:tabs>
+        <w:ind w:left="6480" w:hanging="360"/>
+      </w:pPr>
+    </w:lvl>
+  </w:abstractNum>
+  <w:abstractNum w:abstractNumId="14" w15:restartNumberingAfterBreak="0">
+    <w:nsid w:val="4B007B4E"/>
+    <w:multiLevelType w:val="hybridMultilevel"/>
+    <w:tmpl w:val="412A5B0A"/>
+    <w:lvl w:ilvl="0" w:tplc="0809000F">
+      <w:start w:val="1"/>
+      <w:numFmt w:val="decimal"/>
+      <w:lvlText w:val="%1."/>
+      <w:lvlJc w:val="left"/>
+      <w:pPr>
+        <w:ind w:left="720" w:hanging="360"/>
+      </w:pPr>
+    </w:lvl>
+    <w:lvl w:ilvl="1" w:tplc="08090019" w:tentative="1">
+      <w:start w:val="1"/>
+      <w:numFmt w:val="lowerLetter"/>
+      <w:lvlText w:val="%2."/>
+      <w:lvlJc w:val="left"/>
+      <w:pPr>
+        <w:ind w:left="1440" w:hanging="360"/>
+      </w:pPr>
+    </w:lvl>
+    <w:lvl w:ilvl="2" w:tplc="0809001B" w:tentative="1">
+      <w:start w:val="1"/>
+      <w:numFmt w:val="lowerRoman"/>
+      <w:lvlText w:val="%3."/>
+      <w:lvlJc w:val="right"/>
+      <w:pPr>
+        <w:ind w:left="2160" w:hanging="180"/>
+      </w:pPr>
+    </w:lvl>
+    <w:lvl w:ilvl="3" w:tplc="0809000F" w:tentative="1">
+      <w:start w:val="1"/>
+      <w:numFmt w:val="decimal"/>
+      <w:lvlText w:val="%4."/>
+      <w:lvlJc w:val="left"/>
+      <w:pPr>
+        <w:ind w:left="2880" w:hanging="360"/>
+      </w:pPr>
+    </w:lvl>
+    <w:lvl w:ilvl="4" w:tplc="08090019" w:tentative="1">
+      <w:start w:val="1"/>
+      <w:numFmt w:val="lowerLetter"/>
+      <w:lvlText w:val="%5."/>
+      <w:lvlJc w:val="left"/>
+      <w:pPr>
+        <w:ind w:left="3600" w:hanging="360"/>
+      </w:pPr>
+    </w:lvl>
+    <w:lvl w:ilvl="5" w:tplc="0809001B" w:tentative="1">
+      <w:start w:val="1"/>
+      <w:numFmt w:val="lowerRoman"/>
+      <w:lvlText w:val="%6."/>
+      <w:lvlJc w:val="right"/>
+      <w:pPr>
+        <w:ind w:left="4320" w:hanging="180"/>
+      </w:pPr>
+    </w:lvl>
+    <w:lvl w:ilvl="6" w:tplc="0809000F" w:tentative="1">
+      <w:start w:val="1"/>
+      <w:numFmt w:val="decimal"/>
+      <w:lvlText w:val="%7."/>
+      <w:lvlJc w:val="left"/>
+      <w:pPr>
+        <w:ind w:left="5040" w:hanging="360"/>
+      </w:pPr>
+    </w:lvl>
+    <w:lvl w:ilvl="7" w:tplc="08090019" w:tentative="1">
+      <w:start w:val="1"/>
+      <w:numFmt w:val="lowerLetter"/>
+      <w:lvlText w:val="%8."/>
+      <w:lvlJc w:val="left"/>
+      <w:pPr>
+        <w:ind w:left="5760" w:hanging="360"/>
+      </w:pPr>
+    </w:lvl>
+    <w:lvl w:ilvl="8" w:tplc="0809001B" w:tentative="1">
+      <w:start w:val="1"/>
+      <w:numFmt w:val="lowerRoman"/>
+      <w:lvlText w:val="%9."/>
+      <w:lvlJc w:val="right"/>
+      <w:pPr>
+        <w:ind w:left="6480" w:hanging="180"/>
+      </w:pPr>
     </w:lvl>
   </w:abstractNum>
   <w:num w:numId="1" w16cid:durableId="1889804835">
@@ -998,6 +2472,12 @@
   </w:num>
   <w:num w:numId="13" w16cid:durableId="989942560">
     <w:abstractNumId w:val="12"/>
+  </w:num>
+  <w:num w:numId="14" w16cid:durableId="1034579188">
+    <w:abstractNumId w:val="13"/>
+  </w:num>
+  <w:num w:numId="15" w16cid:durableId="801964183">
+    <w:abstractNumId w:val="14"/>
   </w:num>
 </w:numbering>
 </file>
@@ -1423,6 +2903,28 @@
       <w:szCs w:val="28"/>
     </w:rPr>
   </w:style>
+  <w:style w:type="paragraph" w:styleId="Heading3">
+    <w:name w:val="heading 3"/>
+    <w:basedOn w:val="Normal"/>
+    <w:next w:val="Normal"/>
+    <w:link w:val="Heading3Char"/>
+    <w:uiPriority w:val="9"/>
+    <w:unhideWhenUsed/>
+    <w:qFormat/>
+    <w:rsid w:val="00DE4AD4"/>
+    <w:pPr>
+      <w:keepNext/>
+      <w:keepLines/>
+      <w:spacing w:before="40" w:after="0"/>
+      <w:outlineLvl w:val="2"/>
+    </w:pPr>
+    <w:rPr>
+      <w:rFonts w:asciiTheme="majorHAnsi" w:eastAsiaTheme="majorEastAsia" w:hAnsiTheme="majorHAnsi" w:cstheme="majorBidi"/>
+      <w:color w:val="243F60" w:themeColor="accent1" w:themeShade="7F"/>
+      <w:sz w:val="24"/>
+      <w:szCs w:val="24"/>
+    </w:rPr>
+  </w:style>
   <w:style w:type="character" w:default="1" w:styleId="DefaultParagraphFont">
     <w:name w:val="Default Paragraph Font"/>
     <w:uiPriority w:val="1"/>
@@ -1459,6 +2961,154 @@
       <w:rFonts w:ascii="Consolas" w:eastAsia="Consolas" w:hAnsi="Consolas" w:cs="Consolas"/>
       <w:sz w:val="20"/>
       <w:szCs w:val="20"/>
+    </w:rPr>
+  </w:style>
+  <w:style w:type="paragraph" w:styleId="NormalWeb">
+    <w:name w:val="Normal (Web)"/>
+    <w:basedOn w:val="Normal"/>
+    <w:uiPriority w:val="99"/>
+    <w:semiHidden/>
+    <w:unhideWhenUsed/>
+    <w:rsid w:val="00411E34"/>
+    <w:pPr>
+      <w:spacing w:before="100" w:beforeAutospacing="1" w:after="100" w:afterAutospacing="1"/>
+    </w:pPr>
+    <w:rPr>
+      <w:rFonts w:ascii="Times New Roman" w:eastAsia="Times New Roman" w:hAnsi="Times New Roman" w:cs="Times New Roman"/>
+      <w:sz w:val="24"/>
+      <w:szCs w:val="24"/>
+      <w:lang w:val="en-RU" w:eastAsia="en-GB"/>
+    </w:rPr>
+  </w:style>
+  <w:style w:type="character" w:styleId="Strong">
+    <w:name w:val="Strong"/>
+    <w:basedOn w:val="DefaultParagraphFont"/>
+    <w:uiPriority w:val="22"/>
+    <w:qFormat/>
+    <w:rsid w:val="00411E34"/>
+    <w:rPr>
+      <w:b/>
+      <w:bCs/>
+    </w:rPr>
+  </w:style>
+  <w:style w:type="paragraph" w:styleId="ListParagraph">
+    <w:name w:val="List Paragraph"/>
+    <w:basedOn w:val="Normal"/>
+    <w:uiPriority w:val="34"/>
+    <w:qFormat/>
+    <w:rsid w:val="00411E34"/>
+    <w:pPr>
+      <w:ind w:left="720"/>
+      <w:contextualSpacing/>
+    </w:pPr>
+  </w:style>
+  <w:style w:type="character" w:customStyle="1" w:styleId="Heading3Char">
+    <w:name w:val="Heading 3 Char"/>
+    <w:basedOn w:val="DefaultParagraphFont"/>
+    <w:link w:val="Heading3"/>
+    <w:uiPriority w:val="9"/>
+    <w:rsid w:val="00DE4AD4"/>
+    <w:rPr>
+      <w:rFonts w:asciiTheme="majorHAnsi" w:eastAsiaTheme="majorEastAsia" w:hAnsiTheme="majorHAnsi" w:cstheme="majorBidi"/>
+      <w:color w:val="243F60" w:themeColor="accent1" w:themeShade="7F"/>
+      <w:sz w:val="24"/>
+      <w:szCs w:val="24"/>
+    </w:rPr>
+  </w:style>
+  <w:style w:type="character" w:styleId="CommentReference">
+    <w:name w:val="annotation reference"/>
+    <w:basedOn w:val="DefaultParagraphFont"/>
+    <w:uiPriority w:val="99"/>
+    <w:semiHidden/>
+    <w:unhideWhenUsed/>
+    <w:rsid w:val="00FA4037"/>
+    <w:rPr>
+      <w:sz w:val="16"/>
+      <w:szCs w:val="16"/>
+    </w:rPr>
+  </w:style>
+  <w:style w:type="paragraph" w:styleId="CommentText">
+    <w:name w:val="annotation text"/>
+    <w:basedOn w:val="Normal"/>
+    <w:link w:val="CommentTextChar"/>
+    <w:uiPriority w:val="99"/>
+    <w:semiHidden/>
+    <w:unhideWhenUsed/>
+    <w:rsid w:val="00FA4037"/>
+    <w:rPr>
+      <w:sz w:val="20"/>
+      <w:szCs w:val="20"/>
+    </w:rPr>
+  </w:style>
+  <w:style w:type="character" w:customStyle="1" w:styleId="CommentTextChar">
+    <w:name w:val="Comment Text Char"/>
+    <w:basedOn w:val="DefaultParagraphFont"/>
+    <w:link w:val="CommentText"/>
+    <w:uiPriority w:val="99"/>
+    <w:semiHidden/>
+    <w:rsid w:val="00FA4037"/>
+    <w:rPr>
+      <w:sz w:val="20"/>
+      <w:szCs w:val="20"/>
+    </w:rPr>
+  </w:style>
+  <w:style w:type="paragraph" w:styleId="CommentSubject">
+    <w:name w:val="annotation subject"/>
+    <w:basedOn w:val="CommentText"/>
+    <w:next w:val="CommentText"/>
+    <w:link w:val="CommentSubjectChar"/>
+    <w:uiPriority w:val="99"/>
+    <w:semiHidden/>
+    <w:unhideWhenUsed/>
+    <w:rsid w:val="00FA4037"/>
+    <w:rPr>
+      <w:b/>
+      <w:bCs/>
+    </w:rPr>
+  </w:style>
+  <w:style w:type="character" w:customStyle="1" w:styleId="CommentSubjectChar">
+    <w:name w:val="Comment Subject Char"/>
+    <w:basedOn w:val="CommentTextChar"/>
+    <w:link w:val="CommentSubject"/>
+    <w:uiPriority w:val="99"/>
+    <w:semiHidden/>
+    <w:rsid w:val="00FA4037"/>
+    <w:rPr>
+      <w:b/>
+      <w:bCs/>
+      <w:sz w:val="20"/>
+      <w:szCs w:val="20"/>
+    </w:rPr>
+  </w:style>
+  <w:style w:type="paragraph" w:styleId="Quote">
+    <w:name w:val="Quote"/>
+    <w:basedOn w:val="Normal"/>
+    <w:next w:val="Normal"/>
+    <w:link w:val="QuoteChar"/>
+    <w:uiPriority w:val="29"/>
+    <w:qFormat/>
+    <w:rsid w:val="00872C9C"/>
+    <w:pPr>
+      <w:spacing w:before="200"/>
+      <w:ind w:left="864" w:right="864"/>
+      <w:jc w:val="center"/>
+    </w:pPr>
+    <w:rPr>
+      <w:i/>
+      <w:iCs/>
+      <w:color w:val="404040" w:themeColor="text1" w:themeTint="BF"/>
+    </w:rPr>
+  </w:style>
+  <w:style w:type="character" w:customStyle="1" w:styleId="QuoteChar">
+    <w:name w:val="Quote Char"/>
+    <w:basedOn w:val="DefaultParagraphFont"/>
+    <w:link w:val="Quote"/>
+    <w:uiPriority w:val="29"/>
+    <w:rsid w:val="00872C9C"/>
+    <w:rPr>
+      <w:i/>
+      <w:iCs/>
+      <w:color w:val="404040" w:themeColor="text1" w:themeTint="BF"/>
     </w:rPr>
   </w:style>
 </w:styles>

</xml_diff>